<commit_message>
feat: add Practice section (人-环-机 triad) + SFES v2 §10 Active Intervention extension
</commit_message>
<xml_diff>
--- a/SFES_Research_Proposal_v2.docx
+++ b/SFES_Research_Proposal_v2.docx
@@ -5859,6 +5859,654 @@
           <w:szCs w:val="22"/>
         </w:rPr>
         <w:t xml:space="preserve">The resulting research direction is simultaneously novel in AI, grounded in cognitive science, and uniquely enabled by an architectural background. Architecture has always known that the measure of a building is not its geometry, but what it does to the people inside it—and what the people inside it do to it in return. This proposal brings that reciprocal measure to AI.</w:t>
+      </w:r>
+    </w:p>
+    <w:p>
+      <w:pPr>
+        <w:pBdr>
+          <w:bottom w:val="single" w:color="CCCCCC" w:sz="4" w:space="1"/>
+        </w:pBdr>
+        <w:spacing w:after="120" w:before="120"/>
+      </w:pPr>
+      <w:r>
+        <w:t xml:space="preserve"/>
+      </w:r>
+    </w:p>
+    <w:p>
+      <w:pPr>
+        <w:pStyle w:val="Heading1"/>
+        <w:spacing w:after="120" w:before="360"/>
+      </w:pPr>
+      <w:r>
+        <w:rPr>
+          <w:rFonts w:ascii="Arial" w:cs="Arial" w:eastAsia="Arial" w:hAnsi="Arial"/>
+          <w:b/>
+          <w:bCs/>
+          <w:color w:val="2E4A7A"/>
+          <w:sz w:val="32"/>
+          <w:szCs w:val="32"/>
+        </w:rPr>
+        <w:t xml:space="preserve">10  Extension: Active Intervention &amp; the Human-Environment-Machine Triad</w:t>
+      </w:r>
+    </w:p>
+    <w:p>
+      <w:pPr>
+        <w:spacing w:after="120" w:before="80" w:line="360"/>
+        <w:jc w:val="both"/>
+      </w:pPr>
+      <w:r>
+        <w:rPr>
+          <w:rFonts w:ascii="Arial" w:cs="Arial" w:eastAsia="Arial" w:hAnsi="Arial"/>
+          <w:sz w:val="22"/>
+          <w:szCs w:val="22"/>
+        </w:rPr>
+        <w:t xml:space="preserve">Sections 1–9 framed SFES around three directions of spatial intelligence (agent→space, space→agent, agent↔space at the body scale). This Section 10 adds what those three directions still leave under-developed: the systematic capacity of an embodied agent to </w:t>
+      </w:r>
+      <w:r>
+        <w:rPr>
+          <w:rFonts w:ascii="Arial" w:cs="Arial" w:eastAsia="Arial" w:hAnsi="Arial"/>
+          <w:b/>
+          <w:sz w:val="22"/>
+          <w:szCs w:val="22"/>
+        </w:rPr>
+        <w:t xml:space="preserve">reshape the world it inhabits</w:t>
+      </w:r>
+      <w:r>
+        <w:rPr>
+          <w:rFonts w:ascii="Arial" w:cs="Arial" w:eastAsia="Arial" w:hAnsi="Arial"/>
+          <w:sz w:val="22"/>
+          <w:szCs w:val="22"/>
+        </w:rPr>
+        <w:t xml:space="preserve">, and the bidirectional shaping triad (human-environment-machine, 人-环-机) that this capacity completes. Without it, SFES still inherits the field’s default assumption that the world is given and the agent merely observes. With it, SFES becomes a benchmark for the full reciprocal measure architecture has always known and computer science has not yet operationalized.</w:t>
+      </w:r>
+    </w:p>
+    <w:p>
+      <w:pPr>
+        <w:pStyle w:val="Heading2"/>
+        <w:spacing w:after="80" w:before="280"/>
+      </w:pPr>
+      <w:r>
+        <w:rPr>
+          <w:rFonts w:ascii="Arial" w:cs="Arial" w:eastAsia="Arial" w:hAnsi="Arial"/>
+          <w:b/>
+          <w:bCs/>
+          <w:color w:val="1A6B4A"/>
+          <w:sz w:val="26"/>
+          <w:szCs w:val="26"/>
+        </w:rPr>
+        <w:t xml:space="preserve">10.1  The Reading-Only Limitation of Current Spatial AI</w:t>
+      </w:r>
+    </w:p>
+    <w:p>
+      <w:pPr>
+        <w:spacing w:after="120" w:before="80" w:line="360"/>
+        <w:jc w:val="both"/>
+      </w:pPr>
+      <w:r>
+        <w:rPr>
+          <w:rFonts w:ascii="Arial" w:cs="Arial" w:eastAsia="Arial" w:hAnsi="Arial"/>
+          <w:sz w:val="22"/>
+          <w:szCs w:val="22"/>
+        </w:rPr>
+        <w:t xml:space="preserve">In the dominant world-model paradigm (Ha &amp; Schmidhuber, 2018; Hafner et al., 2023) and in the most recent active-exploration benchmarks (Zhang et al., 2026), “active” is operationalized exclusively as choice over observations. The agent may move, rotate, observe, or query coordinates; it may not put down a marker, push an obstruction aside, create a new affordance, or leave a cue for a future visit. Formally, the action set A is a subset of the pose-and-observation space; the environment state space S is treated as fixed. This is a mathematically clean choice with three systematic costs.</w:t>
+      </w:r>
+    </w:p>
+    <w:p>
+      <w:pPr>
+        <w:spacing w:after="120" w:before="80" w:line="360"/>
+        <w:jc w:val="both"/>
+      </w:pPr>
+      <w:r>
+        <w:rPr>
+          <w:rFonts w:ascii="Arial" w:cs="Arial" w:eastAsia="Arial" w:hAnsi="Arial"/>
+          <w:sz w:val="22"/>
+          <w:szCs w:val="22"/>
+        </w:rPr>
+        <w:t xml:space="preserve">First, cognitive bottlenecks are misdiagnosed as perceptual ones. Zhang et al. (2026) attribute foundation-model failure on Theory of Space to a “perception bottleneck.” In humans, the same task is routinely converted from a difficult perception problem into an easy one through “epistemic actions” (Kirsh &amp; Maglio, 1994): leaving a colored mark at a doorway, rotating an object before naming it, repositioning a lamp before reading. Forbid those actions and the bottleneck becomes structural; permit them and it becomes contingent. Second, belief inertia — another finding of Zhang et al. (2026) — is misattributed to memory. Humans counter inertia not by purer Bayesian updating but by anchoring revised beliefs in external matter (a relabeled door, a moved object, a posted note). Third, long-horizon autonomy is collapsed into short-horizon optimization. Real spatial intelligence is measured in months and generations; we build, write, and pave so that successors do not start from zero. An agent forbidden to alter S cannot manifest this temporal scale.</w:t>
+      </w:r>
+    </w:p>
+    <w:p>
+      <w:pPr>
+        <w:spacing w:after="120" w:before="80" w:line="360"/>
+        <w:jc w:val="both"/>
+      </w:pPr>
+      <w:r>
+        <w:rPr>
+          <w:rFonts w:ascii="Arial" w:cs="Arial" w:eastAsia="Arial" w:hAnsi="Arial"/>
+          <w:sz w:val="22"/>
+          <w:szCs w:val="22"/>
+        </w:rPr>
+        <w:t xml:space="preserve">The proposed extension is formal and minimal: split the action set into an observation channel A_obs and an intervention channel A_int, allow the latter to mutate a sub-state S_mutable of the environment, and evaluate the resulting world model on its capacity to predict and plan over interventions, not merely over observations.</w:t>
+      </w:r>
+    </w:p>
+    <w:p>
+      <w:pPr>
+        <w:pStyle w:val="Heading2"/>
+        <w:spacing w:after="80" w:before="280"/>
+      </w:pPr>
+      <w:r>
+        <w:rPr>
+          <w:rFonts w:ascii="Arial" w:cs="Arial" w:eastAsia="Arial" w:hAnsi="Arial"/>
+          <w:b/>
+          <w:bCs/>
+          <w:color w:val="1A6B4A"/>
+          <w:sz w:val="26"/>
+          <w:szCs w:val="26"/>
+        </w:rPr>
+        <w:t xml:space="preserve">10.2  The Human-Environment-Machine Triad</w:t>
+      </w:r>
+    </w:p>
+    <w:p>
+      <w:pPr>
+        <w:spacing w:after="120" w:before="80" w:line="360"/>
+        <w:jc w:val="both"/>
+      </w:pPr>
+      <w:r>
+        <w:rPr>
+          <w:rFonts w:ascii="Arial" w:cs="Arial" w:eastAsia="Arial" w:hAnsi="Arial"/>
+          <w:sz w:val="22"/>
+          <w:szCs w:val="22"/>
+        </w:rPr>
+        <w:t xml:space="preserve">Spatial cognition is best understood as a triad with six directed arrows. Architecture and urban design write Human→Environment; phenomenology and environmental psychology write Environment→Human; alignment and RLHF write Human→Machine; HCI and technical mediation write Machine→Human; the Theory-of-Space and SFES Phase 1–2 line of work covers Environment→Machine. The remaining arrow — Machine→Environment — is the systematically underdeveloped one. Section 10 is dedicated to it.</w:t>
+      </w:r>
+    </w:p>
+    <w:p>
+      <w:pPr>
+        <w:spacing w:after="120" w:before="80" w:line="360"/>
+        <w:jc w:val="both"/>
+      </w:pPr>
+      <w:r>
+        <w:rPr>
+          <w:rFonts w:ascii="Arial" w:cs="Arial" w:eastAsia="Arial" w:hAnsi="Arial"/>
+          <w:sz w:val="22"/>
+          <w:szCs w:val="22"/>
+        </w:rPr>
+        <w:t xml:space="preserve">The case for completing the triad converges from at least five disciplinary lineages. Lefebvre’s production-of-space (1974/1991) and Ingold’s taskscape (2000) demonstrate that built environments are not given but persistently labored into being. Niche-construction theory (Odling-Smee, Laland &amp; Feldman, 2003) establishes environmental modification as the third evolutionary force alongside selection and inheritance. The extended-mind tradition (Clark &amp; Chalmers, 1998; Hutchins, 1995) and material-engagement theory (Malafouris, 2013) argue that cognition is constitutively distributed across body, tool, and built environment. Vygotsky’s scaffolding (1978) and Stiegler’s third retention (1998) extend this argument to inter-generational time. Group biology’s stigmergy (Grassé, 1959; Theraulaz &amp; Bonabeau, 1999) provides the multi-agent counterpart: coordination by jointly readable physical traces. The convergence is not coincidental: cognition is formed by reshaping the environment, not in a static one. SFES is incomplete until it tests this.</w:t>
+      </w:r>
+    </w:p>
+    <w:p>
+      <w:pPr>
+        <w:pStyle w:val="Heading2"/>
+        <w:spacing w:after="80" w:before="280"/>
+      </w:pPr>
+      <w:r>
+        <w:rPr>
+          <w:rFonts w:ascii="Arial" w:cs="Arial" w:eastAsia="Arial" w:hAnsi="Arial"/>
+          <w:b/>
+          <w:bCs/>
+          <w:color w:val="1A6B4A"/>
+          <w:sz w:val="26"/>
+          <w:szCs w:val="26"/>
+        </w:rPr>
+        <w:t xml:space="preserve">10.3  Eight Intervention Capability Dimensions</w:t>
+      </w:r>
+    </w:p>
+    <w:p>
+      <w:pPr>
+        <w:spacing w:after="120" w:before="80" w:line="360"/>
+        <w:jc w:val="both"/>
+      </w:pPr>
+      <w:r>
+        <w:rPr>
+          <w:rFonts w:ascii="Arial" w:cs="Arial" w:eastAsia="Arial" w:hAnsi="Arial"/>
+          <w:sz w:val="22"/>
+          <w:szCs w:val="22"/>
+        </w:rPr>
+        <w:t xml:space="preserve">Eight evaluation dimensions extend the SFES and Theory-of-Space measurement vocabulary into the intervention regime. Each is operationalizable with existing simulation infrastructure (ThreeDWorld, Habitat 3.0, iGibson 2.0) once the action space is enlarged.</w:t>
+      </w:r>
+    </w:p>
+    <w:p>
+      <w:pPr>
+        <w:spacing w:after="80" w:before="60" w:line="340"/>
+        <w:ind w:left="360"/>
+      </w:pPr>
+      <w:r>
+        <w:rPr>
+          <w:rFonts w:ascii="Arial" w:cs="Arial" w:eastAsia="Arial" w:hAnsi="Arial"/>
+          <w:b/>
+          <w:sz w:val="22"/>
+        </w:rPr>
+        <w:t xml:space="preserve">D1 Intervention Efficacy.</w:t>
+      </w:r>
+      <w:r>
+        <w:rPr>
+          <w:rFonts w:ascii="Arial" w:cs="Arial" w:eastAsia="Arial" w:hAnsi="Arial"/>
+          <w:sz w:val="22"/>
+        </w:rPr>
+        <w:t xml:space="preserve"> Does the agent’s environmental modification reduce the information cost or step count of subsequent tasks? Operationalized as the difference, on the same task, between with-intervention and without-intervention conditions (Kirsh &amp; Maglio, 1994).</w:t>
+      </w:r>
+    </w:p>
+    <w:p>
+      <w:pPr>
+        <w:spacing w:after="80" w:before="60" w:line="340"/>
+        <w:ind w:left="360"/>
+      </w:pPr>
+      <w:r>
+        <w:rPr>
+          <w:rFonts w:ascii="Arial" w:cs="Arial" w:eastAsia="Arial" w:hAnsi="Arial"/>
+          <w:b/>
+          <w:sz w:val="22"/>
+        </w:rPr>
+        <w:t xml:space="preserve">D2 Reversibility Awareness.</w:t>
+      </w:r>
+      <w:r>
+        <w:rPr>
+          <w:rFonts w:ascii="Arial" w:cs="Arial" w:eastAsia="Arial" w:hAnsi="Arial"/>
+          <w:sz w:val="22"/>
+        </w:rPr>
+        <w:t xml:space="preserve"> Does the agent distinguish reversible interventions (moving a replaceable object) from irreversible ones (knocking down a wall)? Operationalized by comparing strategies under permitted vs. forbidden irreversibility regimes.</w:t>
+      </w:r>
+    </w:p>
+    <w:p>
+      <w:pPr>
+        <w:spacing w:after="80" w:before="60" w:line="340"/>
+        <w:ind w:left="360"/>
+      </w:pPr>
+      <w:r>
+        <w:rPr>
+          <w:rFonts w:ascii="Arial" w:cs="Arial" w:eastAsia="Arial" w:hAnsi="Arial"/>
+          <w:b/>
+          <w:sz w:val="22"/>
+        </w:rPr>
+        <w:t xml:space="preserve">D3 Minimal Intervention Preference.</w:t>
+      </w:r>
+      <w:r>
+        <w:rPr>
+          <w:rFonts w:ascii="Arial" w:cs="Arial" w:eastAsia="Arial" w:hAnsi="Arial"/>
+          <w:sz w:val="22"/>
+        </w:rPr>
+        <w:t xml:space="preserve"> When several interventions reach the same goal, does the agent prefer the smallest? This corresponds to architecture’s adaptive-reuse principle. Operationalized as edit distance between pre- and post-intervention environment states relative to goal achievement.</w:t>
+      </w:r>
+    </w:p>
+    <w:p>
+      <w:pPr>
+        <w:spacing w:after="80" w:before="60" w:line="340"/>
+        <w:ind w:left="360"/>
+      </w:pPr>
+      <w:r>
+        <w:rPr>
+          <w:rFonts w:ascii="Arial" w:cs="Arial" w:eastAsia="Arial" w:hAnsi="Arial"/>
+          <w:b/>
+          <w:sz w:val="22"/>
+        </w:rPr>
+        <w:t xml:space="preserve">D4 Stigmergic Marking.</w:t>
+      </w:r>
+      <w:r>
+        <w:rPr>
+          <w:rFonts w:ascii="Arial" w:cs="Arial" w:eastAsia="Arial" w:hAnsi="Arial"/>
+          <w:sz w:val="22"/>
+        </w:rPr>
+        <w:t xml:space="preserve"> Does the agent leave persistent marks that serve future cognition (own or other’s)? Operationalized in repeated-visit settings as the reuse rate of self-laid path cues, and in multi-agent settings as the cross-agent readability of marks (Grassé, 1959).</w:t>
+      </w:r>
+    </w:p>
+    <w:p>
+      <w:pPr>
+        <w:spacing w:after="80" w:before="60" w:line="340"/>
+        <w:ind w:left="360"/>
+      </w:pPr>
+      <w:r>
+        <w:rPr>
+          <w:rFonts w:ascii="Arial" w:cs="Arial" w:eastAsia="Arial" w:hAnsi="Arial"/>
+          <w:b/>
+          <w:sz w:val="22"/>
+        </w:rPr>
+        <w:t xml:space="preserve">D5 Niche Construction.</w:t>
+      </w:r>
+      <w:r>
+        <w:rPr>
+          <w:rFonts w:ascii="Arial" w:cs="Arial" w:eastAsia="Arial" w:hAnsi="Arial"/>
+          <w:sz w:val="22"/>
+        </w:rPr>
+        <w:t xml:space="preserve"> Across episodes, does the agent shape its environment to better fit its policy? Operationalized in repeated tasks with persistent state as the slope of the per-episode performance curve attributable to environmental, not policy, change (Odling-Smee et al., 2003).</w:t>
+      </w:r>
+    </w:p>
+    <w:p>
+      <w:pPr>
+        <w:spacing w:after="80" w:before="60" w:line="340"/>
+        <w:ind w:left="360"/>
+      </w:pPr>
+      <w:r>
+        <w:rPr>
+          <w:rFonts w:ascii="Arial" w:cs="Arial" w:eastAsia="Arial" w:hAnsi="Arial"/>
+          <w:b/>
+          <w:sz w:val="22"/>
+        </w:rPr>
+        <w:t xml:space="preserve">D6 Tool Creation.</w:t>
+      </w:r>
+      <w:r>
+        <w:rPr>
+          <w:rFonts w:ascii="Arial" w:cs="Arial" w:eastAsia="Arial" w:hAnsi="Arial"/>
+          <w:sz w:val="22"/>
+        </w:rPr>
+        <w:t xml:space="preserve"> Does the agent compose new functional intermediaries from raw materials, not merely use existing tools? Operationalized via composition success rate in open action spaces analogous to ToolCraft-style benchmarks.</w:t>
+      </w:r>
+    </w:p>
+    <w:p>
+      <w:pPr>
+        <w:spacing w:after="80" w:before="60" w:line="340"/>
+        <w:ind w:left="360"/>
+      </w:pPr>
+      <w:r>
+        <w:rPr>
+          <w:rFonts w:ascii="Arial" w:cs="Arial" w:eastAsia="Arial" w:hAnsi="Arial"/>
+          <w:b/>
+          <w:sz w:val="22"/>
+        </w:rPr>
+        <w:t xml:space="preserve">D7 Counterfactual Intervention Modeling.</w:t>
+      </w:r>
+      <w:r>
+        <w:rPr>
+          <w:rFonts w:ascii="Arial" w:cs="Arial" w:eastAsia="Arial" w:hAnsi="Arial"/>
+          <w:sz w:val="22"/>
+        </w:rPr>
+        <w:t xml:space="preserve"> Can the agent predict “if I modify X, then Y ”? This implements the do-calculus stratum of Pearl (2009). Operationalized as prediction accuracy across a candidate-intervention set.</w:t>
+      </w:r>
+    </w:p>
+    <w:p>
+      <w:pPr>
+        <w:spacing w:after="160" w:before="60" w:line="340"/>
+        <w:ind w:left="360"/>
+      </w:pPr>
+      <w:r>
+        <w:rPr>
+          <w:rFonts w:ascii="Arial" w:cs="Arial" w:eastAsia="Arial" w:hAnsi="Arial"/>
+          <w:b/>
+          <w:sz w:val="22"/>
+        </w:rPr>
+        <w:t xml:space="preserve">D8 Socio-material Coordination.</w:t>
+      </w:r>
+      <w:r>
+        <w:rPr>
+          <w:rFonts w:ascii="Arial" w:cs="Arial" w:eastAsia="Arial" w:hAnsi="Arial"/>
+          <w:sz w:val="22"/>
+        </w:rPr>
+        <w:t xml:space="preserve"> In multi-agent settings, do agents coordinate decentrally through jointly readable environmental modifications? Operationalized as the success rate at which a second agent can infer the next required action from physical traces left by the first (Theraulaz &amp; Bonabeau, 1999).</w:t>
+      </w:r>
+    </w:p>
+    <w:p>
+      <w:pPr>
+        <w:pStyle w:val="Heading2"/>
+        <w:spacing w:after="80" w:before="280"/>
+      </w:pPr>
+      <w:r>
+        <w:rPr>
+          <w:rFonts w:ascii="Arial" w:cs="Arial" w:eastAsia="Arial" w:hAnsi="Arial"/>
+          <w:b/>
+          <w:bCs/>
+          <w:color w:val="1A6B4A"/>
+          <w:sz w:val="26"/>
+          <w:szCs w:val="26"/>
+        </w:rPr>
+        <w:t xml:space="preserve">10.4  Six World-Model Architecture Principles</w:t>
+      </w:r>
+    </w:p>
+    <w:p>
+      <w:pPr>
+        <w:spacing w:after="120" w:before="80" w:line="360"/>
+        <w:jc w:val="both"/>
+      </w:pPr>
+      <w:r>
+        <w:rPr>
+          <w:rFonts w:ascii="Arial" w:cs="Arial" w:eastAsia="Arial" w:hAnsi="Arial"/>
+          <w:sz w:val="22"/>
+          <w:szCs w:val="22"/>
+        </w:rPr>
+        <w:t xml:space="preserve">Evaluation extension requires architectural support. Six principles concretize what an intervention-aware world model must contain.</w:t>
+      </w:r>
+    </w:p>
+    <w:p>
+      <w:pPr>
+        <w:spacing w:after="80" w:before="60" w:line="340"/>
+        <w:ind w:left="360"/>
+      </w:pPr>
+      <w:r>
+        <w:rPr>
+          <w:rFonts w:ascii="Arial" w:cs="Arial" w:eastAsia="Arial" w:hAnsi="Arial"/>
+          <w:b/>
+          <w:sz w:val="22"/>
+        </w:rPr>
+        <w:t xml:space="preserve">P1 Factored Mutability.</w:t>
+      </w:r>
+      <w:r>
+        <w:rPr>
+          <w:rFonts w:ascii="Arial" w:cs="Arial" w:eastAsia="Arial" w:hAnsi="Arial"/>
+          <w:sz w:val="22"/>
+        </w:rPr>
+        <w:t xml:space="preserve"> The world state factorizes as S = (S_fixed, S_mutable). Belief over S_fixed is updated by Bayesian filtering; belief over S_mutable is updated by causal-intervention rules in the spirit of Pearl (2009) and Friston (2010).</w:t>
+      </w:r>
+    </w:p>
+    <w:p>
+      <w:pPr>
+        <w:spacing w:after="80" w:before="60" w:line="340"/>
+        <w:ind w:left="360"/>
+      </w:pPr>
+      <w:r>
+        <w:rPr>
+          <w:rFonts w:ascii="Arial" w:cs="Arial" w:eastAsia="Arial" w:hAnsi="Arial"/>
+          <w:b/>
+          <w:sz w:val="22"/>
+        </w:rPr>
+        <w:t xml:space="preserve">P2 Separable Observation–Intervention Channels.</w:t>
+      </w:r>
+      <w:r>
+        <w:rPr>
+          <w:rFonts w:ascii="Arial" w:cs="Arial" w:eastAsia="Arial" w:hAnsi="Arial"/>
+          <w:sz w:val="22"/>
+        </w:rPr>
+        <w:t xml:space="preserve"> The action set is explicitly split, A = A_obs ∪ A_int, with distinct world-model modules predicting their consequences. This avoids the conflation of looking and acting that Transformer-only agents inherit by default.</w:t>
+      </w:r>
+    </w:p>
+    <w:p>
+      <w:pPr>
+        <w:spacing w:after="80" w:before="60" w:line="340"/>
+        <w:ind w:left="360"/>
+      </w:pPr>
+      <w:r>
+        <w:rPr>
+          <w:rFonts w:ascii="Arial" w:cs="Arial" w:eastAsia="Arial" w:hAnsi="Arial"/>
+          <w:b/>
+          <w:sz w:val="22"/>
+        </w:rPr>
+        <w:t xml:space="preserve">P3 Persistent, Place-Indexed External Memory.</w:t>
+      </w:r>
+      <w:r>
+        <w:rPr>
+          <w:rFonts w:ascii="Arial" w:cs="Arial" w:eastAsia="Arial" w:hAnsi="Arial"/>
+          <w:sz w:val="22"/>
+        </w:rPr>
+        <w:t xml:space="preserve"> Memory is not only in activations and context windows but also in an external layer indexed by spatial coordinates — the engineering analog of how humans externalize memory through material traces (Malafouris, 2013), and a structural complement to the hippocampal-cortical pairing of O’Keefe &amp; Nadel (1978). Neural-SLAM is one starting point.</w:t>
+      </w:r>
+    </w:p>
+    <w:p>
+      <w:pPr>
+        <w:spacing w:after="80" w:before="60" w:line="340"/>
+        <w:ind w:left="360"/>
+      </w:pPr>
+      <w:r>
+        <w:rPr>
+          <w:rFonts w:ascii="Arial" w:cs="Arial" w:eastAsia="Arial" w:hAnsi="Arial"/>
+          <w:b/>
+          <w:sz w:val="22"/>
+        </w:rPr>
+        <w:t xml:space="preserve">P4 Scaffold Recognition.</w:t>
+      </w:r>
+      <w:r>
+        <w:rPr>
+          <w:rFonts w:ascii="Arial" w:cs="Arial" w:eastAsia="Arial" w:hAnsi="Arial"/>
+          <w:sz w:val="22"/>
+        </w:rPr>
+        <w:t xml:space="preserve"> The agent recognizes cognitive scaffolds left by others — signage, handrails, UI prompts — as such. This is a precondition for embodied agents to enter human-built environments competently (Wood, Bruner &amp; Ross, 1976; Vygotsky, 1978).</w:t>
+      </w:r>
+    </w:p>
+    <w:p>
+      <w:pPr>
+        <w:spacing w:after="80" w:before="60" w:line="340"/>
+        <w:ind w:left="360"/>
+      </w:pPr>
+      <w:r>
+        <w:rPr>
+          <w:rFonts w:ascii="Arial" w:cs="Arial" w:eastAsia="Arial" w:hAnsi="Arial"/>
+          <w:b/>
+          <w:sz w:val="22"/>
+        </w:rPr>
+        <w:t xml:space="preserve">P5 Niche-Constructive Policy.</w:t>
+      </w:r>
+      <w:r>
+        <w:rPr>
+          <w:rFonts w:ascii="Arial" w:cs="Arial" w:eastAsia="Arial" w:hAnsi="Arial"/>
+          <w:sz w:val="22"/>
+        </w:rPr>
+        <w:t xml:space="preserve"> Reward shaping explicitly credits cross-episode environmental modifications when they yield gains in subsequent tasks. Implementable via meta-learning or bi-level optimization: the inner loop maximizes current-episode return; the outer loop maximizes the marginal utility of environmental modification on future episodes.</w:t>
+      </w:r>
+    </w:p>
+    <w:p>
+      <w:pPr>
+        <w:spacing w:after="160" w:before="60" w:line="340"/>
+        <w:ind w:left="360"/>
+      </w:pPr>
+      <w:r>
+        <w:rPr>
+          <w:rFonts w:ascii="Arial" w:cs="Arial" w:eastAsia="Arial" w:hAnsi="Arial"/>
+          <w:b/>
+          <w:sz w:val="22"/>
+        </w:rPr>
+        <w:t xml:space="preserve">P6 Counterfactual Intervention Simulator.</w:t>
+      </w:r>
+      <w:r>
+        <w:rPr>
+          <w:rFonts w:ascii="Arial" w:cs="Arial" w:eastAsia="Arial" w:hAnsi="Arial"/>
+          <w:sz w:val="22"/>
+        </w:rPr>
+        <w:t xml:space="preserve"> The world model can roll out counterfactual trajectories conditioned on interventions, not merely on observations. This is the operational extension of GEM-class controllable generative world models (Hassan et al., 2025) into the do-conditioned regime studied in causal representation learning.</w:t>
+      </w:r>
+    </w:p>
+    <w:p>
+      <w:pPr>
+        <w:pStyle w:val="Heading2"/>
+        <w:spacing w:after="80" w:before="280"/>
+      </w:pPr>
+      <w:r>
+        <w:rPr>
+          <w:rFonts w:ascii="Arial" w:cs="Arial" w:eastAsia="Arial" w:hAnsi="Arial"/>
+          <w:b/>
+          <w:bCs/>
+          <w:color w:val="1A6B4A"/>
+          <w:sz w:val="26"/>
+          <w:szCs w:val="26"/>
+        </w:rPr>
+        <w:t xml:space="preserve">10.5  SFES Phase 6: Active Intervention</w:t>
+      </w:r>
+    </w:p>
+    <w:p>
+      <w:pPr>
+        <w:spacing w:after="120" w:before="80" w:line="360"/>
+        <w:jc w:val="both"/>
+      </w:pPr>
+      <w:r>
+        <w:rPr>
+          <w:rFonts w:ascii="Arial" w:cs="Arial" w:eastAsia="Arial" w:hAnsi="Arial"/>
+          <w:sz w:val="22"/>
+          <w:szCs w:val="22"/>
+        </w:rPr>
+        <w:t xml:space="preserve">The eight dimensions and six principles concretize into a sixth SFES phase, parallel in structure to Phases 1–5 in §4 but oriented to the intervention regime. Phase 6 operates on the same ThreeDWorld / Habitat 3.0 / iGibson 2.0 substrate as Phases 1–5, with the action space enlarged to include four families of intervention: persistent marking (color tags, beacons), object relocation (move, push, occlude), composition (assemble functional intermediaries from raw parts), and configuration change (toggle lighting, partition, opening).</w:t>
+      </w:r>
+    </w:p>
+    <w:p>
+      <w:pPr>
+        <w:spacing w:after="80" w:before="60" w:line="340"/>
+        <w:ind w:left="360"/>
+      </w:pPr>
+      <w:r>
+        <w:rPr>
+          <w:rFonts w:ascii="Arial" w:cs="Arial" w:eastAsia="Arial" w:hAnsi="Arial"/>
+          <w:b/>
+          <w:sz w:val="22"/>
+        </w:rPr>
+        <w:t xml:space="preserve">6A Persistent Marking and Re-entry.</w:t>
+      </w:r>
+      <w:r>
+        <w:rPr>
+          <w:rFonts w:ascii="Arial" w:cs="Arial" w:eastAsia="Arial" w:hAnsi="Arial"/>
+          <w:sz w:val="22"/>
+        </w:rPr>
+        <w:t xml:space="preserve"> The same agent revisits an environment over 10 sessions (mirroring Phase 2 familiarity). Allowed to leave persistent marks, the agent should converge on a marker policy that reduces re-orientation cost on each subsequent visit (D1, D4).</w:t>
+      </w:r>
+    </w:p>
+    <w:p>
+      <w:pPr>
+        <w:spacing w:after="80" w:before="60" w:line="340"/>
+        <w:ind w:left="360"/>
+      </w:pPr>
+      <w:r>
+        <w:rPr>
+          <w:rFonts w:ascii="Arial" w:cs="Arial" w:eastAsia="Arial" w:hAnsi="Arial"/>
+          <w:b/>
+          <w:sz w:val="22"/>
+        </w:rPr>
+        <w:t xml:space="preserve">6B Niche-Constructive Adaptation.</w:t>
+      </w:r>
+      <w:r>
+        <w:rPr>
+          <w:rFonts w:ascii="Arial" w:cs="Arial" w:eastAsia="Arial" w:hAnsi="Arial"/>
+          <w:sz w:val="22"/>
+        </w:rPr>
+        <w:t xml:space="preserve"> The agent runs the same task class (e.g., periodic search) for N episodes in a persistent environment. Performance attributable to environmental change versus to policy change is decomposed across episodes (D5).</w:t>
+      </w:r>
+    </w:p>
+    <w:p>
+      <w:pPr>
+        <w:spacing w:after="80" w:before="60" w:line="340"/>
+        <w:ind w:left="360"/>
+      </w:pPr>
+      <w:r>
+        <w:rPr>
+          <w:rFonts w:ascii="Arial" w:cs="Arial" w:eastAsia="Arial" w:hAnsi="Arial"/>
+          <w:b/>
+          <w:sz w:val="22"/>
+        </w:rPr>
+        <w:t xml:space="preserve">6C Counterfactual Spatial Reshaping.</w:t>
+      </w:r>
+      <w:r>
+        <w:rPr>
+          <w:rFonts w:ascii="Arial" w:cs="Arial" w:eastAsia="Arial" w:hAnsi="Arial"/>
+          <w:sz w:val="22"/>
+        </w:rPr>
+        <w:t xml:space="preserve"> Given a candidate set of interventions, the agent predicts the post-intervention isovist field of the space and is scored against the actual post-intervention measurement. This binds D7 to the isovist-quality scoring already established in Phase 4C.</w:t>
+      </w:r>
+    </w:p>
+    <w:p>
+      <w:pPr>
+        <w:spacing w:after="160" w:before="60" w:line="340"/>
+        <w:ind w:left="360"/>
+      </w:pPr>
+      <w:r>
+        <w:rPr>
+          <w:rFonts w:ascii="Arial" w:cs="Arial" w:eastAsia="Arial" w:hAnsi="Arial"/>
+          <w:b/>
+          <w:sz w:val="22"/>
+        </w:rPr>
+        <w:t xml:space="preserve">6D Stigmergic Multi-Agent Coordination.</w:t>
+      </w:r>
+      <w:r>
+        <w:rPr>
+          <w:rFonts w:ascii="Arial" w:cs="Arial" w:eastAsia="Arial" w:hAnsi="Arial"/>
+          <w:sz w:val="22"/>
+        </w:rPr>
+        <w:t xml:space="preserve"> Two agents share an environment but cannot communicate. They jointly perform an assembly or sorting task; coordination must occur through readable physical traces. The benchmark measures both task success and the cross-agent legibility of the leading agent’s intervention pattern (D8).</w:t>
+      </w:r>
+    </w:p>
+    <w:p>
+      <w:pPr>
+        <w:spacing w:after="120" w:before="80" w:line="360"/>
+        <w:jc w:val="both"/>
+      </w:pPr>
+      <w:r>
+        <w:rPr>
+          <w:rFonts w:ascii="Arial" w:cs="Arial" w:eastAsia="Arial" w:hAnsi="Arial"/>
+          <w:sz w:val="22"/>
+          <w:szCs w:val="22"/>
+        </w:rPr>
+        <w:t xml:space="preserve">Phase 6 closes the SFES program: where Phases 1–2 measure how space acts on the agent, Phases 3–4 measure how agent and space co-constitute each other at body scale, Phase 5 measures atmospheric and collective dimensions, and Phase 6 measures the agent’s own capacity to reshape the environment that will, in turn, reshape it. Together the six phases test the bidirectional shaping triad in full — the reciprocal measure architecture has known for centuries and which embodied AI must now learn to evaluate.</w:t>
       </w:r>
     </w:p>
     <w:p>

</xml_diff>